<commit_message>
Fix price-schedule line numbering (was showing "1.1", "2.2")
The line-item loop cell carried both Word list auto-numbering (numId) and the
injected {{nums}} placeholder, so each row rendered as "<list>.<nums>" — "1.1",
"2.2". Strip the list numbering from the data cell and keep {{nums}}, matching
the original beautiful-creations template (clean "1, 2, 3"). Also remove the
stray list number from loverealm's LOT section sub-header row.

Found via end-to-end visual rendering (Quick Look) — leftover-brace checks can't
catch this since it's a formatting/value issue, not an unrendered tag.

Co-Authored-By: Claude Opus 4.8 <noreply@anthropic.com>
</commit_message>
<xml_diff>
--- a/public/templates/bc-medicals/quotation/PRICE SCHEDULE.docx
+++ b/public/templates/bc-medicals/quotation/PRICE SCHEDULE.docx
@@ -304,11 +304,6 @@
           </w:tcPr>
           <w:p>
             <w:pPr>
-              <w:pStyle w:val="ListParagraph"/>
-              <w:numPr>
-                <w:ilvl w:val="0"/>
-                <w:numId w:val="1"/>
-              </w:numPr>
               <w:jc w:val="center"/>
               <w:rPr>
                 <w:rFonts w:ascii="Times New Roman" w:hAnsi="Times New Roman" w:cs="Times New Roman"/>

</xml_diff>